<commit_message>
feat: add CI workflow + Dockerfile + prod config + PostgreSQL migration
</commit_message>
<xml_diff>
--- a/Otros/BazarAPI_Context.docx
+++ b/Otros/BazarAPI_Context.docx
@@ -8509,7 +8509,7 @@
                 <w:sz w:val="18"/>
                 <w:szCs w:val="18"/>
               </w:rPr>
-              <w:t xml:space="preserve">Deploy Railway + GitHub Actions</w:t>
+              <w:t xml:space="preserve">Deploy Render + Supabase + GitHub Actions CI</w:t>
             </w:r>
           </w:p>
         </w:tc>
@@ -8912,7 +8912,7 @@
           <w:sz w:val="28"/>
           <w:szCs w:val="28"/>
         </w:rPr>
-        <w:t xml:space="preserve">Próximo Paso al Retomar</w:t>
+        <w:t xml:space="preserve">Decisiones de Infraestructura — Migración a PostgreSQL</w:t>
       </w:r>
     </w:p>
     <w:p>
@@ -8926,15 +8926,7 @@
           <w:sz w:val="20"/>
           <w:szCs w:val="20"/>
         </w:rPr>
-        <w:t xml:space="preserve">Fase 5 — Deploy Railway + GitHub Actions</w:t>
-      </w:r>
-    </w:p>
-    <w:p>
-      <w:pPr>
-        <w:spacing w:after="80"/>
-      </w:pPr>
-      <w:r>
-        <w:t xml:space="preserve"/>
+        <w:t xml:space="preserve">Railway y PlanetScale descartados — ambos eliminaron su free tier.</w:t>
       </w:r>
     </w:p>
     <w:p>
@@ -8946,7 +8938,21 @@
           <w:sz w:val="20"/>
           <w:szCs w:val="20"/>
         </w:rPr>
-        <w:t xml:space="preserve">Pasos:</w:t>
+        <w:t xml:space="preserve">Stack de deploy gratuito elegido: Render (backend) + Supabase (PostgreSQL).</w:t>
+      </w:r>
+    </w:p>
+    <w:p>
+      <w:pPr>
+        <w:spacing w:after="80"/>
+      </w:pPr>
+      <w:r>
+        <w:rPr>
+          <w:b/>
+          <w:bCs/>
+          <w:sz w:val="20"/>
+          <w:szCs w:val="20"/>
+        </w:rPr>
+        <w:t xml:space="preserve">Archivos modificados para la migración MySQL → PostgreSQL:</w:t>
       </w:r>
     </w:p>
     <w:p>
@@ -8965,7 +8971,7 @@
           <w:sz w:val="20"/>
           <w:szCs w:val="20"/>
         </w:rPr>
-        <w:t xml:space="preserve">Crear cuenta en Railway (railway.app)</w:t>
+        <w:t xml:space="preserve">pom.xml: reemplazado mysql-connector-j y flyway-mysql por postgresql driver y flyway-database-postgresql. Versión de Flyway forzada a 10.20.1 para soporte de PostgreSQL 17.</w:t>
       </w:r>
     </w:p>
     <w:p>
@@ -8984,7 +8990,7 @@
           <w:sz w:val="20"/>
           <w:szCs w:val="20"/>
         </w:rPr>
-        <w:t xml:space="preserve">Crear proyecto nuevo en Railway → Deploy from GitHub repo</w:t>
+        <w:t xml:space="preserve">application.yml: URL default cambiada a jdbc:postgresql://localhost:5432/bazar_api. Parámetros MySQL-específicos eliminados.</w:t>
       </w:r>
     </w:p>
     <w:p>
@@ -9003,7 +9009,7 @@
           <w:sz w:val="20"/>
           <w:szCs w:val="20"/>
         </w:rPr>
-        <w:t xml:space="preserve">Agregar servicio MySQL en Railway y conectarlo al backend</w:t>
+        <w:t xml:space="preserve">application-prod.yml: agregado database-platform: org.hibernate.dialect.PostgreSQLDialect y hibernate.boot.allow_jdbc_metadata_access: false para reducir tiempo de arranque. HikariCP pool size: 2.</w:t>
       </w:r>
     </w:p>
     <w:p>
@@ -9022,7 +9028,7 @@
           <w:sz w:val="20"/>
           <w:szCs w:val="20"/>
         </w:rPr>
-        <w:t xml:space="preserve">Configurar variables de entorno en Railway: DB_URL, DB_USERNAME, DB_PASSWORD</w:t>
+        <w:t xml:space="preserve">docker-compose.yml: imagen mysql:8.4 reemplazada por postgres:16. Puerto 3306 → 5432. Variables MYSQL_* → POSTGRES_*. Healthcheck actualizado a pg_isready.</w:t>
       </w:r>
     </w:p>
     <w:p>
@@ -9041,7 +9047,7 @@
           <w:sz w:val="20"/>
           <w:szCs w:val="20"/>
         </w:rPr>
-        <w:t xml:space="preserve">Verificar que Flyway corre las migraciones en producción al primer deploy</w:t>
+        <w:t xml:space="preserve">V1__create_tables.sql: AUTO_INCREMENT → BIGSERIAL, DOUBLE → DOUBLE PRECISION, BIT(1) DEFAULT b’1’ → BOOLEAN DEFAULT TRUE.</w:t>
       </w:r>
     </w:p>
     <w:p>
@@ -9060,7 +9066,7 @@
           <w:sz w:val="20"/>
           <w:szCs w:val="20"/>
         </w:rPr>
-        <w:t xml:space="preserve">Configurar GitHub Actions: workflow de CI que corre mvn test en cada push a main</w:t>
+        <w:t xml:space="preserve">V2__alter_products_stock_to_int.sql: MODIFY COLUMN → ALTER COLUMN stock TYPE INT USING stock::INT.</w:t>
       </w:r>
     </w:p>
     <w:p>
@@ -9079,7 +9085,7 @@
           <w:sz w:val="20"/>
           <w:szCs w:val="20"/>
         </w:rPr>
-        <w:t xml:space="preserve">Verificar que la API responde en la URL pública de Railway</w:t>
+        <w:t xml:space="preserve">Dockerfile agregado en bazar-api/ — multi-stage build: maven:3.9.6-eclipse-temurin-17 para compilar, eclipse-temurin:17-jre para correr el JAR.</w:t>
       </w:r>
     </w:p>
     <w:p>
@@ -9092,14 +9098,186 @@
     </w:p>
     <w:p>
       <w:pPr>
+        <w:spacing w:after="80"/>
+      </w:pPr>
+      <w:r>
+        <w:rPr>
+          <w:b/>
+          <w:bCs/>
+          <w:sz w:val="20"/>
+          <w:szCs w:val="20"/>
+        </w:rPr>
+        <w:t xml:space="preserve">Infraestructura de producción — Completada:</w:t>
+      </w:r>
+    </w:p>
+    <w:p>
+      <w:pPr>
+        <w:pStyle w:val="ListParagraph"/>
+        <w:numPr>
+          <w:ilvl w:val="0"/>
+          <w:numId w:val="2"/>
+        </w:numPr>
+        <w:spacing w:after="80"/>
+      </w:pPr>
+      <w:r>
+        <w:rPr>
+          <w:b w:val="false"/>
+          <w:bCs w:val="false"/>
+          <w:sz w:val="20"/>
+          <w:szCs w:val="20"/>
+        </w:rPr>
+        <w:t xml:space="preserve">Supabase: proyecto bazar-api creado en región South America (São Paulo). PostgreSQL 17.6. Usuario: postgres.sgpuuxqswstccrssgvtw. Host: aws-1-sa-east-1.pooler.supabase.com:5432.</w:t>
+      </w:r>
+    </w:p>
+    <w:p>
+      <w:pPr>
+        <w:pStyle w:val="ListParagraph"/>
+        <w:numPr>
+          <w:ilvl w:val="0"/>
+          <w:numId w:val="2"/>
+        </w:numPr>
+        <w:spacing w:after="80"/>
+      </w:pPr>
+      <w:r>
+        <w:rPr>
+          <w:b w:val="false"/>
+          <w:bCs w:val="false"/>
+          <w:sz w:val="20"/>
+          <w:szCs w:val="20"/>
+        </w:rPr>
+        <w:t xml:space="preserve">Render: servicio bazar-api deployado. Dockerfile path: bazar-api/Dockerfile. Variables de entorno configuradas: DB_URL, DB_USERNAME, DB_PASSWORD, SPRING_PROFILES_ACTIVE=prod.</w:t>
+      </w:r>
+    </w:p>
+    <w:p>
+      <w:pPr>
+        <w:pStyle w:val="ListParagraph"/>
+        <w:numPr>
+          <w:ilvl w:val="0"/>
+          <w:numId w:val="2"/>
+        </w:numPr>
+        <w:spacing w:after="80"/>
+      </w:pPr>
+      <w:r>
+        <w:rPr>
+          <w:b w:val="false"/>
+          <w:bCs w:val="false"/>
+          <w:sz w:val="20"/>
+          <w:szCs w:val="20"/>
+        </w:rPr>
+        <w:t xml:space="preserve">Flyway: migraciones V1 y V2 aplicadas correctamente en producción. Schema validado por Hibernate.</w:t>
+      </w:r>
+    </w:p>
+    <w:p>
+      <w:pPr>
+        <w:pStyle w:val="ListParagraph"/>
+        <w:numPr>
+          <w:ilvl w:val="0"/>
+          <w:numId w:val="2"/>
+        </w:numPr>
+        <w:spacing w:after="80"/>
+      </w:pPr>
+      <w:r>
+        <w:rPr>
+          <w:b w:val="false"/>
+          <w:bCs w:val="false"/>
+          <w:sz w:val="20"/>
+          <w:szCs w:val="20"/>
+        </w:rPr>
+        <w:t xml:space="preserve">API respondiendo en producción — Swagger accesible en /swagger-ui.html. Nota: el free tier de Render duerme el servicio tras 15 min de inactividad; el primer request tarda ~30-60s en despertar.</w:t>
+      </w:r>
+    </w:p>
+    <w:p>
+      <w:pPr>
+        <w:spacing w:after="80"/>
+      </w:pPr>
+      <w:r>
+        <w:t xml:space="preserve"/>
+      </w:r>
+    </w:p>
+    <w:p>
+      <w:pPr>
+        <w:pStyle w:val="Heading1"/>
+      </w:pPr>
+      <w:r>
+        <w:rPr>
+          <w:b/>
+          <w:bCs/>
+          <w:color w:val="2E4057"/>
+          <w:sz w:val="28"/>
+          <w:szCs w:val="28"/>
+        </w:rPr>
+        <w:t xml:space="preserve">Próximo Paso al Retomar</w:t>
+      </w:r>
+    </w:p>
+    <w:p>
+      <w:pPr>
         <w:spacing w:after="120"/>
       </w:pPr>
       <w:r>
         <w:rPr>
-          <w:sz w:val="20"/>
-          <w:szCs w:val="20"/>
-        </w:rPr>
-        <w:t xml:space="preserve">Archivo a crear: .github/workflows/ci.yml</w:t>
+          <w:b/>
+          <w:bCs/>
+          <w:sz w:val="20"/>
+          <w:szCs w:val="20"/>
+        </w:rPr>
+        <w:t xml:space="preserve">Fase 5 — GitHub Actions CI (lo que falta)</w:t>
+      </w:r>
+    </w:p>
+    <w:p>
+      <w:pPr>
+        <w:pStyle w:val="ListParagraph"/>
+        <w:numPr>
+          <w:ilvl w:val="0"/>
+          <w:numId w:val="2"/>
+        </w:numPr>
+        <w:spacing w:after="80"/>
+      </w:pPr>
+      <w:r>
+        <w:rPr>
+          <w:b w:val="false"/>
+          <w:bCs w:val="false"/>
+          <w:sz w:val="20"/>
+          <w:szCs w:val="20"/>
+        </w:rPr>
+        <w:t xml:space="preserve">Crear .github/workflows/ci.yml — workflow que corre mvn test en cada push a main usando H2 (sin Docker).</w:t>
+      </w:r>
+    </w:p>
+    <w:p>
+      <w:pPr>
+        <w:pStyle w:val="ListParagraph"/>
+        <w:numPr>
+          <w:ilvl w:val="0"/>
+          <w:numId w:val="2"/>
+        </w:numPr>
+        <w:spacing w:after="80"/>
+      </w:pPr>
+      <w:r>
+        <w:rPr>
+          <w:b w:val="false"/>
+          <w:bCs w:val="false"/>
+          <w:sz w:val="20"/>
+          <w:szCs w:val="20"/>
+        </w:rPr>
+        <w:t xml:space="preserve">Verificar que el badge de CI aparece en verde en el repo de GitHub.</w:t>
+      </w:r>
+    </w:p>
+    <w:p>
+      <w:pPr>
+        <w:pStyle w:val="ListParagraph"/>
+        <w:numPr>
+          <w:ilvl w:val="0"/>
+          <w:numId w:val="2"/>
+        </w:numPr>
+        <w:spacing w:after="80"/>
+      </w:pPr>
+      <w:r>
+        <w:rPr>
+          <w:b w:val="false"/>
+          <w:bCs w:val="false"/>
+          <w:sz w:val="20"/>
+          <w:szCs w:val="20"/>
+        </w:rPr>
+        <w:t xml:space="preserve">Configurar CORS en Spring para aceptar requests desde Vercel (necesario antes de Fase 6 — Frontend React).</w:t>
       </w:r>
     </w:p>
     <w:p>
@@ -9111,7 +9289,7 @@
           <w:sz w:val="20"/>
           <w:szCs w:val="20"/>
         </w:rPr>
-        <w:t xml:space="preserve">Consideraciones: configurar CORS en Spring para aceptar requests desde Vercel (Fase 6).</w:t>
+        <w:t xml:space="preserve">Luego continuar con Fase 6 (Frontend React) y Fase 7 (Deploy Vercel + README profesional).</w:t>
       </w:r>
     </w:p>
     <w:sectPr>

</xml_diff>

<commit_message>
feat: add global CORS configuration
</commit_message>
<xml_diff>
--- a/Otros/BazarAPI_Context.docx
+++ b/Otros/BazarAPI_Context.docx
@@ -8540,7 +8540,7 @@
                 <w:sz w:val="18"/>
                 <w:szCs w:val="18"/>
               </w:rPr>
-              <w:t xml:space="preserve">🔄 En curso</w:t>
+              <w:t xml:space="preserve">✅ Completado</w:t>
             </w:r>
           </w:p>
         </w:tc>
@@ -9220,7 +9220,19 @@
           <w:sz w:val="20"/>
           <w:szCs w:val="20"/>
         </w:rPr>
-        <w:t xml:space="preserve">Fase 5 — GitHub Actions CI (lo que falta)</w:t>
+        <w:t xml:space="preserve">Fase 6 — Frontend React</w:t>
+      </w:r>
+    </w:p>
+    <w:p>
+      <w:pPr>
+        <w:spacing w:after="120"/>
+      </w:pPr>
+      <w:r>
+        <w:rPr>
+          <w:sz w:val="20"/>
+          <w:szCs w:val="20"/>
+        </w:rPr>
+        <w:t xml:space="preserve">Pasos previos antes de arrancar el frontend:</w:t>
       </w:r>
     </w:p>
     <w:p>
@@ -9239,7 +9251,7 @@
           <w:sz w:val="20"/>
           <w:szCs w:val="20"/>
         </w:rPr>
-        <w:t xml:space="preserve">Crear .github/workflows/ci.yml — workflow que corre mvn test en cada push a main usando H2 (sin Docker).</w:t>
+        <w:t xml:space="preserve">Configurar CORS en Spring Boot para aceptar requests desde localhost:3000 (desarrollo) y el dominio de Vercel (producción). Agregar CorsConfig en el paquete config/.</w:t>
       </w:r>
     </w:p>
     <w:p>
@@ -9258,7 +9270,7 @@
           <w:sz w:val="20"/>
           <w:szCs w:val="20"/>
         </w:rPr>
-        <w:t xml:space="preserve">Verificar que el badge de CI aparece en verde en el repo de GitHub.</w:t>
+        <w:t xml:space="preserve">Crear el proyecto React en bazar-frontend/ con Vite + Axios. Definir estructura de carpetas: pages/, components/, services/.</w:t>
       </w:r>
     </w:p>
     <w:p>
@@ -9277,7 +9289,26 @@
           <w:sz w:val="20"/>
           <w:szCs w:val="20"/>
         </w:rPr>
-        <w:t xml:space="preserve">Configurar CORS en Spring para aceptar requests desde Vercel (necesario antes de Fase 6 — Frontend React).</w:t>
+        <w:t xml:space="preserve">Implementar vistas: Products, Customers, Sales. CRUD completo consumiendo la API de Render.</w:t>
+      </w:r>
+    </w:p>
+    <w:p>
+      <w:pPr>
+        <w:pStyle w:val="ListParagraph"/>
+        <w:numPr>
+          <w:ilvl w:val="0"/>
+          <w:numId w:val="2"/>
+        </w:numPr>
+        <w:spacing w:after="80"/>
+      </w:pPr>
+      <w:r>
+        <w:rPr>
+          <w:b w:val="false"/>
+          <w:bCs w:val="false"/>
+          <w:sz w:val="20"/>
+          <w:szCs w:val="20"/>
+        </w:rPr>
+        <w:t xml:space="preserve">Deploy en Vercel conectado al repo de GitHub. Configurar variable de entorno VITE_API_URL con la URL pública de Render.</w:t>
       </w:r>
     </w:p>
     <w:p>
@@ -9289,7 +9320,7 @@
           <w:sz w:val="20"/>
           <w:szCs w:val="20"/>
         </w:rPr>
-        <w:t xml:space="preserve">Luego continuar con Fase 6 (Frontend React) y Fase 7 (Deploy Vercel + README profesional).</w:t>
+        <w:t xml:space="preserve">Luego continuar con Fase 7 (README profesional con badges de CI, link a Swagger, link al frontend deployado).</w:t>
       </w:r>
     </w:p>
     <w:sectPr>

</xml_diff>